<commit_message>
Shared database, BFF removal, templates, and wireframes skill
- Docs and inputs (repo-structure.md, tech-stack.md, CLAUDE.md, both Lite
  docs) updated for the shared platform_db architecture and the removal of
  the BFF layer: the browser now calls each service directly via CORS.
  BaseWorkspace_Structure_Lite regenerated as v5.
- Added scaffold/templates/ (backend-service, backend-module,
  frontend-module) so adding a service or module is copy-paste-rename
  instead of hand-copying.
- Added the wireframes skill (.claude/skills/wireframes/) and .claude/launch.json.
- Synced agent-policies.md and .claude/agents/*.md wireframe-fidelity and
  service-data-privacy (R7) enforcement.

Co-Authored-By: Claude Sonnet 5 <noreply@anthropic.com>
</commit_message>
<xml_diff>
--- a/docs/BaseWorkspace_Agent_Policies_Lite.docx
+++ b/docs/BaseWorkspace_Agent_Policies_Lite.docx
@@ -55,7 +55,7 @@
           <w:sz w:val="24"/>
           <w:szCs w:val="24"/>
         </w:rPr>
-        <w:t xml:space="preserve">Minimum Viable Policy Set (Lite v1)</w:t>
+        <w:t xml:space="preserve">Minimum Viable Policy Set (Lite v2)</w:t>
       </w:r>
     </w:p>
     <w:p>
@@ -133,7 +133,7 @@
           <w:sz w:val="20"/>
           <w:szCs w:val="20"/>
         </w:rPr>
-        <w:t xml:space="preserve">18 agent policies + 4 cross-cutting = 22 total</w:t>
+        <w:t xml:space="preserve">20 agent policies + 6 cross-cutting = 26 total</w:t>
       </w:r>
     </w:p>
     <w:p>
@@ -199,6 +199,23 @@
     </w:p>
     <w:p>
       <w:pPr>
+        <w:spacing w:after="0" w:before="140"/>
+      </w:pPr>
+      <w:r>
+        <w:rPr>
+          <w:rFonts w:ascii="Calibri" w:cs="Calibri" w:eastAsia="Calibri" w:hAnsi="Calibri"/>
+          <w:b w:val="false"/>
+          <w:bCs w:val="false"/>
+          <w:i/>
+          <w:iCs/>
+          <w:sz w:val="18"/>
+          <w:szCs w:val="18"/>
+        </w:rPr>
+        <w:t xml:space="preserve">Supersedes Lite v1: B7 now requires actually reading the wireframe image before writing code (not just citing it), builds from @app/ui’s shared components, and the reviewer gets a matching check (R6) plus /build gained a screenshot-comparison step. Cross-cutting gained X5/X6 — service-data privacy and contracts-before-implementation — which were already live in CLAUDE.md’s non-negotiables but had never been added here. Backend services then moved to one shared database and schema (platform_db) instead of one database per service — X5’s guarantee stopped being physical, so the new R7 makes it a review-time BLOCKER instead.</w:t>
+      </w:r>
+    </w:p>
+    <w:p>
+      <w:pPr>
         <w:pStyle w:val="Heading1"/>
         <w:spacing w:after="160" w:before="360"/>
       </w:pPr>
@@ -2156,7 +2173,7 @@
                 <w:sz w:val="18"/>
                 <w:szCs w:val="18"/>
               </w:rPr>
-              <w:t xml:space="preserve">UI matches the cited wireframe in layout, hierarchy, and content. Implement loading, empty, and error states even when only the happy path is drawn; log the defaults chosen. A screen with no empty state is not done.</w:t>
+              <w:t xml:space="preserve">Read the wireframe PNG(s) the task cites before writing any component code — citing the filename is not the same as looking at it. UI matches what’s drawn — layout, hierarchy, and content. Implement loading, empty, and error states even when only the happy path is drawn; log the defaults chosen. Build from @app/ui’s shared components (Button, Field, Badge, Card) rather than improvising raw markup per screen. A screen with no empty state is not done.</w:t>
             </w:r>
           </w:p>
         </w:tc>
@@ -2320,7 +2337,7 @@
           <w:sz w:val="30"/>
           <w:szCs w:val="30"/>
         </w:rPr>
-        <w:t xml:space="preserve">3.  Reviewer — 5 policies</w:t>
+        <w:t xml:space="preserve">3.  Reviewer — 7 policies</w:t>
       </w:r>
     </w:p>
     <w:p>
@@ -3049,6 +3066,234 @@
           </w:p>
         </w:tc>
       </w:tr>
+      <w:tr>
+        <w:tc>
+          <w:tcPr>
+            <w:tcW w:type="dxa" w:w="700"/>
+            <w:tcMar>
+              <w:top w:type="dxa" w:w="60"/>
+              <w:left w:type="dxa" w:w="100"/>
+              <w:bottom w:type="dxa" w:w="60"/>
+              <w:right w:type="dxa" w:w="100"/>
+            </w:tcMar>
+          </w:tcPr>
+          <w:p>
+            <w:pPr>
+              <w:spacing w:after="0"/>
+            </w:pPr>
+            <w:r>
+              <w:rPr>
+                <w:rFonts w:ascii="Calibri" w:cs="Calibri" w:eastAsia="Calibri" w:hAnsi="Calibri"/>
+                <w:b w:val="false"/>
+                <w:bCs w:val="false"/>
+                <w:i w:val="false"/>
+                <w:iCs w:val="false"/>
+                <w:sz w:val="18"/>
+                <w:szCs w:val="18"/>
+              </w:rPr>
+              <w:t xml:space="preserve">R6</w:t>
+            </w:r>
+          </w:p>
+        </w:tc>
+        <w:tc>
+          <w:tcPr>
+            <w:tcW w:type="dxa" w:w="1900"/>
+            <w:tcMar>
+              <w:top w:type="dxa" w:w="60"/>
+              <w:left w:type="dxa" w:w="100"/>
+              <w:bottom w:type="dxa" w:w="60"/>
+              <w:right w:type="dxa" w:w="100"/>
+            </w:tcMar>
+          </w:tcPr>
+          <w:p>
+            <w:pPr>
+              <w:spacing w:after="0"/>
+            </w:pPr>
+            <w:r>
+              <w:rPr>
+                <w:rFonts w:ascii="Calibri" w:cs="Calibri" w:eastAsia="Calibri" w:hAnsi="Calibri"/>
+                <w:b w:val="false"/>
+                <w:bCs w:val="false"/>
+                <w:i w:val="false"/>
+                <w:iCs w:val="false"/>
+                <w:sz w:val="18"/>
+                <w:szCs w:val="18"/>
+              </w:rPr>
+              <w:t xml:space="preserve">Conformance Sweep</w:t>
+            </w:r>
+          </w:p>
+        </w:tc>
+        <w:tc>
+          <w:tcPr>
+            <w:tcW w:type="dxa" w:w="5500"/>
+            <w:tcMar>
+              <w:top w:type="dxa" w:w="60"/>
+              <w:left w:type="dxa" w:w="100"/>
+              <w:bottom w:type="dxa" w:w="60"/>
+              <w:right w:type="dxa" w:w="100"/>
+            </w:tcMar>
+          </w:tcPr>
+          <w:p>
+            <w:pPr>
+              <w:spacing w:after="0"/>
+            </w:pPr>
+            <w:r>
+              <w:rPr>
+                <w:rFonts w:ascii="Calibri" w:cs="Calibri" w:eastAsia="Calibri" w:hAnsi="Calibri"/>
+                <w:b w:val="false"/>
+                <w:bCs w:val="false"/>
+                <w:i w:val="false"/>
+                <w:iCs w:val="false"/>
+                <w:sz w:val="18"/>
+                <w:szCs w:val="18"/>
+              </w:rPr>
+              <w:t xml:space="preserve">At SHOULD-FIX unless noted: wireframe fidelity — read the wireframe PNG the task cites and compare it against the diff’s component structure directly, not from the task description alone; stack conformance against tech-stack.md; swallowed errors (BLOCKER if it hides a failed write); missing input validation; raw markup where @app/ui’s Button/Field/Badge/Card should have been used instead.</w:t>
+            </w:r>
+          </w:p>
+        </w:tc>
+        <w:tc>
+          <w:tcPr>
+            <w:tcW w:type="dxa" w:w="1260"/>
+            <w:tcMar>
+              <w:top w:type="dxa" w:w="60"/>
+              <w:left w:type="dxa" w:w="100"/>
+              <w:bottom w:type="dxa" w:w="60"/>
+              <w:right w:type="dxa" w:w="100"/>
+            </w:tcMar>
+          </w:tcPr>
+          <w:p>
+            <w:pPr>
+              <w:spacing w:after="0"/>
+            </w:pPr>
+            <w:r>
+              <w:rPr>
+                <w:rFonts w:ascii="Calibri" w:cs="Calibri" w:eastAsia="Calibri" w:hAnsi="Calibri"/>
+                <w:b w:val="false"/>
+                <w:bCs w:val="false"/>
+                <w:i w:val="false"/>
+                <w:iCs w:val="false"/>
+                <w:sz w:val="18"/>
+                <w:szCs w:val="18"/>
+              </w:rPr>
+              <w:t xml:space="preserve">High</w:t>
+            </w:r>
+          </w:p>
+        </w:tc>
+      </w:tr>
+      <w:tr>
+        <w:tc>
+          <w:tcPr>
+            <w:tcW w:type="dxa" w:w="700"/>
+            <w:tcMar>
+              <w:top w:type="dxa" w:w="60"/>
+              <w:left w:type="dxa" w:w="100"/>
+              <w:bottom w:type="dxa" w:w="60"/>
+              <w:right w:type="dxa" w:w="100"/>
+            </w:tcMar>
+          </w:tcPr>
+          <w:p>
+            <w:pPr>
+              <w:spacing w:after="0"/>
+            </w:pPr>
+            <w:r>
+              <w:rPr>
+                <w:rFonts w:ascii="Calibri" w:cs="Calibri" w:eastAsia="Calibri" w:hAnsi="Calibri"/>
+                <w:b w:val="false"/>
+                <w:bCs w:val="false"/>
+                <w:i w:val="false"/>
+                <w:iCs w:val="false"/>
+                <w:sz w:val="18"/>
+                <w:szCs w:val="18"/>
+              </w:rPr>
+              <w:t xml:space="preserve">R7</w:t>
+            </w:r>
+          </w:p>
+        </w:tc>
+        <w:tc>
+          <w:tcPr>
+            <w:tcW w:type="dxa" w:w="1900"/>
+            <w:tcMar>
+              <w:top w:type="dxa" w:w="60"/>
+              <w:left w:type="dxa" w:w="100"/>
+              <w:bottom w:type="dxa" w:w="60"/>
+              <w:right w:type="dxa" w:w="100"/>
+            </w:tcMar>
+          </w:tcPr>
+          <w:p>
+            <w:pPr>
+              <w:spacing w:after="0"/>
+            </w:pPr>
+            <w:r>
+              <w:rPr>
+                <w:rFonts w:ascii="Calibri" w:cs="Calibri" w:eastAsia="Calibri" w:hAnsi="Calibri"/>
+                <w:b w:val="false"/>
+                <w:bCs w:val="false"/>
+                <w:i w:val="false"/>
+                <w:iCs w:val="false"/>
+                <w:sz w:val="18"/>
+                <w:szCs w:val="18"/>
+              </w:rPr>
+              <w:t xml:space="preserve">Cross-Service Data Isolation</w:t>
+            </w:r>
+          </w:p>
+        </w:tc>
+        <w:tc>
+          <w:tcPr>
+            <w:tcW w:type="dxa" w:w="5500"/>
+            <w:tcMar>
+              <w:top w:type="dxa" w:w="60"/>
+              <w:left w:type="dxa" w:w="100"/>
+              <w:bottom w:type="dxa" w:w="60"/>
+              <w:right w:type="dxa" w:w="100"/>
+            </w:tcMar>
+          </w:tcPr>
+          <w:p>
+            <w:pPr>
+              <w:spacing w:after="0"/>
+            </w:pPr>
+            <w:r>
+              <w:rPr>
+                <w:rFonts w:ascii="Calibri" w:cs="Calibri" w:eastAsia="Calibri" w:hAnsi="Calibri"/>
+                <w:b w:val="false"/>
+                <w:bCs w:val="false"/>
+                <w:i w:val="false"/>
+                <w:iCs w:val="false"/>
+                <w:sz w:val="18"/>
+                <w:szCs w:val="18"/>
+              </w:rPr>
+              <w:t xml:space="preserve">BLOCKER, no exceptions: a service importing or querying another service’s entities, repositories, or tables directly. Every backend service shares one database and schema, so nothing at the infrastructure level stops this — cross-service data must go over HTTP through a published contract instead. This is what makes "service data is private" (X5) an enforced rule rather than a comment nobody’s holding to.</w:t>
+            </w:r>
+          </w:p>
+        </w:tc>
+        <w:tc>
+          <w:tcPr>
+            <w:tcW w:type="dxa" w:w="1260"/>
+            <w:tcMar>
+              <w:top w:type="dxa" w:w="60"/>
+              <w:left w:type="dxa" w:w="100"/>
+              <w:bottom w:type="dxa" w:w="60"/>
+              <w:right w:type="dxa" w:w="100"/>
+            </w:tcMar>
+          </w:tcPr>
+          <w:p>
+            <w:pPr>
+              <w:spacing w:after="0"/>
+            </w:pPr>
+            <w:r>
+              <w:rPr>
+                <w:rFonts w:ascii="Calibri" w:cs="Calibri" w:eastAsia="Calibri" w:hAnsi="Calibri"/>
+                <w:b w:val="false"/>
+                <w:bCs w:val="false"/>
+                <w:i w:val="false"/>
+                <w:iCs w:val="false"/>
+                <w:sz w:val="18"/>
+                <w:szCs w:val="18"/>
+              </w:rPr>
+              <w:t xml:space="preserve">Critical</w:t>
+            </w:r>
+          </w:p>
+        </w:tc>
+      </w:tr>
     </w:tbl>
     <w:p>
       <w:pPr>
@@ -3066,7 +3311,7 @@
           <w:sz w:val="30"/>
           <w:szCs w:val="30"/>
         </w:rPr>
-        <w:t xml:space="preserve">4.  Cross-cutting — 4 policies</w:t>
+        <w:t xml:space="preserve">4.  Cross-cutting — 6 policies</w:t>
       </w:r>
     </w:p>
     <w:p>
@@ -3677,6 +3922,234 @@
                 <w:szCs w:val="18"/>
               </w:rPr>
               <w:t xml:space="preserve">Critical</w:t>
+            </w:r>
+          </w:p>
+        </w:tc>
+      </w:tr>
+      <w:tr>
+        <w:tc>
+          <w:tcPr>
+            <w:tcW w:type="dxa" w:w="700"/>
+            <w:tcMar>
+              <w:top w:type="dxa" w:w="60"/>
+              <w:left w:type="dxa" w:w="100"/>
+              <w:bottom w:type="dxa" w:w="60"/>
+              <w:right w:type="dxa" w:w="100"/>
+            </w:tcMar>
+          </w:tcPr>
+          <w:p>
+            <w:pPr>
+              <w:spacing w:after="0"/>
+            </w:pPr>
+            <w:r>
+              <w:rPr>
+                <w:rFonts w:ascii="Calibri" w:cs="Calibri" w:eastAsia="Calibri" w:hAnsi="Calibri"/>
+                <w:b w:val="false"/>
+                <w:bCs w:val="false"/>
+                <w:i w:val="false"/>
+                <w:iCs w:val="false"/>
+                <w:sz w:val="18"/>
+                <w:szCs w:val="18"/>
+              </w:rPr>
+              <w:t xml:space="preserve">X5</w:t>
+            </w:r>
+          </w:p>
+        </w:tc>
+        <w:tc>
+          <w:tcPr>
+            <w:tcW w:type="dxa" w:w="1900"/>
+            <w:tcMar>
+              <w:top w:type="dxa" w:w="60"/>
+              <w:left w:type="dxa" w:w="100"/>
+              <w:bottom w:type="dxa" w:w="60"/>
+              <w:right w:type="dxa" w:w="100"/>
+            </w:tcMar>
+          </w:tcPr>
+          <w:p>
+            <w:pPr>
+              <w:spacing w:after="0"/>
+            </w:pPr>
+            <w:r>
+              <w:rPr>
+                <w:rFonts w:ascii="Calibri" w:cs="Calibri" w:eastAsia="Calibri" w:hAnsi="Calibri"/>
+                <w:b w:val="false"/>
+                <w:bCs w:val="false"/>
+                <w:i w:val="false"/>
+                <w:iCs w:val="false"/>
+                <w:sz w:val="18"/>
+                <w:szCs w:val="18"/>
+              </w:rPr>
+              <w:t xml:space="preserve">Service Data Is Private</w:t>
+            </w:r>
+          </w:p>
+        </w:tc>
+        <w:tc>
+          <w:tcPr>
+            <w:tcW w:type="dxa" w:w="5500"/>
+            <w:tcMar>
+              <w:top w:type="dxa" w:w="60"/>
+              <w:left w:type="dxa" w:w="100"/>
+              <w:bottom w:type="dxa" w:w="60"/>
+              <w:right w:type="dxa" w:w="100"/>
+            </w:tcMar>
+          </w:tcPr>
+          <w:p>
+            <w:pPr>
+              <w:spacing w:after="0"/>
+            </w:pPr>
+            <w:r>
+              <w:rPr>
+                <w:rFonts w:ascii="Calibri" w:cs="Calibri" w:eastAsia="Calibri" w:hAnsi="Calibri"/>
+                <w:b w:val="false"/>
+                <w:bCs w:val="false"/>
+                <w:i w:val="false"/>
+                <w:iCs w:val="false"/>
+                <w:sz w:val="18"/>
+                <w:szCs w:val="18"/>
+              </w:rPr>
+              <w:t xml:space="preserve">By convention, not infrastructure — every backend service shares one database and schema. No service reads another’s tables regardless; cross-service data goes over HTTP through a published contract. Enforced at review time by R7, since nothing physical stops the violation anymore.</w:t>
+            </w:r>
+          </w:p>
+        </w:tc>
+        <w:tc>
+          <w:tcPr>
+            <w:tcW w:type="dxa" w:w="1260"/>
+            <w:tcMar>
+              <w:top w:type="dxa" w:w="60"/>
+              <w:left w:type="dxa" w:w="100"/>
+              <w:bottom w:type="dxa" w:w="60"/>
+              <w:right w:type="dxa" w:w="100"/>
+            </w:tcMar>
+          </w:tcPr>
+          <w:p>
+            <w:pPr>
+              <w:spacing w:after="0"/>
+            </w:pPr>
+            <w:r>
+              <w:rPr>
+                <w:rFonts w:ascii="Calibri" w:cs="Calibri" w:eastAsia="Calibri" w:hAnsi="Calibri"/>
+                <w:b w:val="false"/>
+                <w:bCs w:val="false"/>
+                <w:i w:val="false"/>
+                <w:iCs w:val="false"/>
+                <w:sz w:val="18"/>
+                <w:szCs w:val="18"/>
+              </w:rPr>
+              <w:t xml:space="preserve">Critical</w:t>
+            </w:r>
+          </w:p>
+        </w:tc>
+      </w:tr>
+      <w:tr>
+        <w:tc>
+          <w:tcPr>
+            <w:tcW w:type="dxa" w:w="700"/>
+            <w:tcMar>
+              <w:top w:type="dxa" w:w="60"/>
+              <w:left w:type="dxa" w:w="100"/>
+              <w:bottom w:type="dxa" w:w="60"/>
+              <w:right w:type="dxa" w:w="100"/>
+            </w:tcMar>
+          </w:tcPr>
+          <w:p>
+            <w:pPr>
+              <w:spacing w:after="0"/>
+            </w:pPr>
+            <w:r>
+              <w:rPr>
+                <w:rFonts w:ascii="Calibri" w:cs="Calibri" w:eastAsia="Calibri" w:hAnsi="Calibri"/>
+                <w:b w:val="false"/>
+                <w:bCs w:val="false"/>
+                <w:i w:val="false"/>
+                <w:iCs w:val="false"/>
+                <w:sz w:val="18"/>
+                <w:szCs w:val="18"/>
+              </w:rPr>
+              <w:t xml:space="preserve">X6</w:t>
+            </w:r>
+          </w:p>
+        </w:tc>
+        <w:tc>
+          <w:tcPr>
+            <w:tcW w:type="dxa" w:w="1900"/>
+            <w:tcMar>
+              <w:top w:type="dxa" w:w="60"/>
+              <w:left w:type="dxa" w:w="100"/>
+              <w:bottom w:type="dxa" w:w="60"/>
+              <w:right w:type="dxa" w:w="100"/>
+            </w:tcMar>
+          </w:tcPr>
+          <w:p>
+            <w:pPr>
+              <w:spacing w:after="0"/>
+            </w:pPr>
+            <w:r>
+              <w:rPr>
+                <w:rFonts w:ascii="Calibri" w:cs="Calibri" w:eastAsia="Calibri" w:hAnsi="Calibri"/>
+                <w:b w:val="false"/>
+                <w:bCs w:val="false"/>
+                <w:i w:val="false"/>
+                <w:iCs w:val="false"/>
+                <w:sz w:val="18"/>
+                <w:szCs w:val="18"/>
+              </w:rPr>
+              <w:t xml:space="preserve">Contracts Before Implementation</w:t>
+            </w:r>
+          </w:p>
+        </w:tc>
+        <w:tc>
+          <w:tcPr>
+            <w:tcW w:type="dxa" w:w="5500"/>
+            <w:tcMar>
+              <w:top w:type="dxa" w:w="60"/>
+              <w:left w:type="dxa" w:w="100"/>
+              <w:bottom w:type="dxa" w:w="60"/>
+              <w:right w:type="dxa" w:w="100"/>
+            </w:tcMar>
+          </w:tcPr>
+          <w:p>
+            <w:pPr>
+              <w:spacing w:after="0"/>
+            </w:pPr>
+            <w:r>
+              <w:rPr>
+                <w:rFonts w:ascii="Calibri" w:cs="Calibri" w:eastAsia="Calibri" w:hAnsi="Calibri"/>
+                <w:b w:val="false"/>
+                <w:bCs w:val="false"/>
+                <w:i w:val="false"/>
+                <w:iCs w:val="false"/>
+                <w:sz w:val="18"/>
+                <w:szCs w:val="18"/>
+              </w:rPr>
+              <w:t xml:space="preserve">A cross-boundary type is added to shared/contracts first, then implemented against — never the reverse. Prevents duplicated types that drift silently.</w:t>
+            </w:r>
+          </w:p>
+        </w:tc>
+        <w:tc>
+          <w:tcPr>
+            <w:tcW w:type="dxa" w:w="1260"/>
+            <w:tcMar>
+              <w:top w:type="dxa" w:w="60"/>
+              <w:left w:type="dxa" w:w="100"/>
+              <w:bottom w:type="dxa" w:w="60"/>
+              <w:right w:type="dxa" w:w="100"/>
+            </w:tcMar>
+          </w:tcPr>
+          <w:p>
+            <w:pPr>
+              <w:spacing w:after="0"/>
+            </w:pPr>
+            <w:r>
+              <w:rPr>
+                <w:rFonts w:ascii="Calibri" w:cs="Calibri" w:eastAsia="Calibri" w:hAnsi="Calibri"/>
+                <w:b w:val="false"/>
+                <w:bCs w:val="false"/>
+                <w:i w:val="false"/>
+                <w:iCs w:val="false"/>
+                <w:sz w:val="18"/>
+                <w:szCs w:val="18"/>
+              </w:rPr>
+              <w:t xml:space="preserve">High</w:t>
             </w:r>
           </w:p>
         </w:tc>
@@ -5096,7 +5569,7 @@
                 <w:sz w:val="18"/>
                 <w:szCs w:val="18"/>
               </w:rPr>
-              <w:t xml:space="preserve">18</w:t>
+              <w:t xml:space="preserve">20</w:t>
             </w:r>
           </w:p>
         </w:tc>
@@ -5210,7 +5683,7 @@
                 <w:sz w:val="18"/>
                 <w:szCs w:val="18"/>
               </w:rPr>
-              <w:t xml:space="preserve">4</w:t>
+              <w:t xml:space="preserve">6</w:t>
             </w:r>
           </w:p>
         </w:tc>
@@ -5266,7 +5739,7 @@
                 <w:sz w:val="18"/>
                 <w:szCs w:val="18"/>
               </w:rPr>
-              <w:t xml:space="preserve">The other 6 protect multi-app, multi-developer concerns</w:t>
+              <w:t xml:space="preserve">The other 4 protect multi-app, multi-developer concerns</w:t>
             </w:r>
           </w:p>
         </w:tc>

</xml_diff>